<commit_message>
Estructurar actas Kairo y controlar su visibilidad
</commit_message>
<xml_diff>
--- a/resources/templates/plantilla_acta_institucional.docx
+++ b/resources/templates/plantilla_acta_institucional.docx
@@ -973,272 +973,6 @@
                 <w:rtl w:val="0"/>
               </w:rPr>
               <w:t xml:space="preserve"> </w:t>
-            </w:r>
-          </w:p>
-        </w:tc>
-      </w:tr>
-      <w:tr>
-        <w:trPr>
-          <w:cantSplit w:val="0"/>
-          <w:trHeight w:val="426" w:hRule="atLeast"/>
-          <w:tblHeader w:val="0"/>
-        </w:trPr>
-        <w:tc>
-          <w:tcPr>
-            <w:gridSpan w:val="2"/>
-            <w:tcBorders>
-              <w:top w:color="000000" w:space="0" w:sz="4" w:val="single"/>
-              <w:left w:color="000000" w:space="0" w:sz="4" w:val="single"/>
-              <w:bottom w:color="000000" w:space="0" w:sz="4" w:val="single"/>
-              <w:right w:color="000000" w:space="0" w:sz="4" w:val="single"/>
-            </w:tcBorders>
-            <w:vAlign w:val="center"/>
-          </w:tcPr>
-          <w:p>
-            <w:pPr>
-              <w:keepNext w:val="0"/>
-              <w:keepLines w:val="0"/>
-              <w:widowControl w:val="1"/>
-              <w:numPr>
-                <w:ilvl w:val="0"/>
-                <w:numId w:val="1"/>
-              </w:numPr>
-              <w:pBdr>
-                <w:top w:space="0" w:sz="0" w:val="nil"/>
-                <w:left w:space="0" w:sz="0" w:val="nil"/>
-                <w:bottom w:space="0" w:sz="0" w:val="nil"/>
-                <w:right w:space="0" w:sz="0" w:val="nil"/>
-                <w:between w:space="0" w:sz="0" w:val="nil"/>
-              </w:pBdr>
-              <w:shd w:fill="auto" w:val="clear"/>
-              <w:spacing w:after="0" w:before="0" w:line="240" w:lineRule="auto"/>
-              <w:ind w:left="33" w:right="175" w:hanging="33"/>
-              <w:jc w:val="center"/>
-              <w:rPr>
-                <w:rFonts w:ascii="Arial" w:cs="Arial" w:eastAsia="Arial" w:hAnsi="Arial"/>
-                <w:b w:val="0"/>
-                <w:bCs w:val="0"/>
-                <w:i w:val="0"/>
-                <w:iCs w:val="0"/>
-                <w:smallCaps w:val="0"/>
-                <w:strike w:val="0"/>
-                <w:color w:val="000000"/>
-                <w:sz w:val="18"/>
-                <w:szCs w:val="18"/>
-                <w:u w:val="none"/>
-                <w:shd w:fill="auto" w:val="clear"/>
-                <w:vertAlign w:val="baseline"/>
-              </w:rPr>
-            </w:pPr>
-            <w:r>
-              <w:rPr>
-                <w:rtl w:val="0"/>
-              </w:rPr>
-            </w:r>
-          </w:p>
-        </w:tc>
-        <w:tc>
-          <w:tcPr>
-            <w:gridSpan w:val="2"/>
-            <w:tcBorders>
-              <w:top w:color="000000" w:space="0" w:sz="4" w:val="single"/>
-              <w:left w:color="000000" w:space="0" w:sz="0" w:val="nil"/>
-              <w:bottom w:color="000000" w:space="0" w:sz="4" w:val="single"/>
-              <w:right w:color="000000" w:space="0" w:sz="4" w:val="single"/>
-            </w:tcBorders>
-            <w:vAlign w:val="center"/>
-          </w:tcPr>
-          <w:p>
-            <w:r>
-              <w:t>{{participante2}}</w:t>
-            </w:r>
-          </w:p>
-        </w:tc>
-        <w:tc>
-          <w:tcPr>
-            <w:gridSpan w:val="3"/>
-            <w:tcBorders>
-              <w:top w:color="000000" w:space="0" w:sz="4" w:val="single"/>
-              <w:left w:color="000000" w:space="0" w:sz="0" w:val="nil"/>
-              <w:bottom w:color="000000" w:space="0" w:sz="4" w:val="single"/>
-              <w:right w:color="000000" w:space="0" w:sz="4" w:val="single"/>
-            </w:tcBorders>
-            <w:vAlign w:val="center"/>
-          </w:tcPr>
-          <w:p>
-            <w:r>
-              <w:t>{{cargo2}}</w:t>
-            </w:r>
-          </w:p>
-        </w:tc>
-        <w:tc>
-          <w:tcPr>
-            <w:gridSpan w:val="4"/>
-            <w:tcBorders>
-              <w:top w:color="000000" w:space="0" w:sz="4" w:val="single"/>
-              <w:left w:color="000000" w:space="0" w:sz="0" w:val="nil"/>
-              <w:bottom w:color="000000" w:space="0" w:sz="4" w:val="single"/>
-              <w:right w:color="000000" w:space="0" w:sz="4" w:val="single"/>
-            </w:tcBorders>
-            <w:vAlign w:val="center"/>
-          </w:tcPr>
-          <w:p>
-            <w:pPr>
-              <w:spacing w:after="0" w:line="240" w:lineRule="auto"/>
-              <w:jc w:val="center"/>
-              <w:rPr>
-                <w:rFonts w:ascii="Arial" w:cs="Arial" w:eastAsia="Arial" w:hAnsi="Arial"/>
-                <w:sz w:val="18"/>
-                <w:szCs w:val="18"/>
-                <w:vertAlign w:val="baseline"/>
-              </w:rPr>
-            </w:pPr>
-            <w:r>
-              <w:rPr>
-                <w:rFonts w:ascii="Arial" w:cs="Arial" w:eastAsia="Arial" w:hAnsi="Arial"/>
-                <w:sz w:val="18"/>
-                <w:szCs w:val="18"/>
-                <w:rtl w:val="0"/>
-              </w:rPr>
-              <w:t xml:space="preserve">Firma electrónica</w:t>
-            </w:r>
-            <w:r>
-              <w:rPr>
-                <w:rtl w:val="0"/>
-              </w:rPr>
-            </w:r>
-          </w:p>
-        </w:tc>
-      </w:tr>
-      <w:tr>
-        <w:trPr>
-          <w:cantSplit w:val="0"/>
-          <w:trHeight w:val="426" w:hRule="atLeast"/>
-          <w:tblHeader w:val="0"/>
-        </w:trPr>
-        <w:tc>
-          <w:tcPr>
-            <w:gridSpan w:val="2"/>
-            <w:tcBorders>
-              <w:top w:color="000000" w:space="0" w:sz="4" w:val="single"/>
-              <w:left w:color="000000" w:space="0" w:sz="4" w:val="single"/>
-              <w:bottom w:color="000000" w:space="0" w:sz="4" w:val="single"/>
-              <w:right w:color="000000" w:space="0" w:sz="4" w:val="single"/>
-            </w:tcBorders>
-            <w:vAlign w:val="center"/>
-          </w:tcPr>
-          <w:p>
-            <w:pPr>
-              <w:keepNext w:val="0"/>
-              <w:keepLines w:val="0"/>
-              <w:widowControl w:val="1"/>
-              <w:numPr>
-                <w:ilvl w:val="0"/>
-                <w:numId w:val="1"/>
-              </w:numPr>
-              <w:pBdr>
-                <w:top w:space="0" w:sz="0" w:val="nil"/>
-                <w:left w:space="0" w:sz="0" w:val="nil"/>
-                <w:bottom w:space="0" w:sz="0" w:val="nil"/>
-                <w:right w:space="0" w:sz="0" w:val="nil"/>
-                <w:between w:space="0" w:sz="0" w:val="nil"/>
-              </w:pBdr>
-              <w:shd w:fill="auto" w:val="clear"/>
-              <w:spacing w:after="0" w:before="0" w:line="240" w:lineRule="auto"/>
-              <w:ind w:left="33" w:right="175" w:hanging="33"/>
-              <w:jc w:val="center"/>
-              <w:rPr>
-                <w:rFonts w:ascii="Arial" w:cs="Arial" w:eastAsia="Arial" w:hAnsi="Arial"/>
-                <w:b w:val="0"/>
-                <w:bCs w:val="0"/>
-                <w:i w:val="0"/>
-                <w:iCs w:val="0"/>
-                <w:smallCaps w:val="0"/>
-                <w:strike w:val="0"/>
-                <w:color w:val="000000"/>
-                <w:sz w:val="18"/>
-                <w:szCs w:val="18"/>
-                <w:u w:val="none"/>
-                <w:shd w:fill="auto" w:val="clear"/>
-                <w:vertAlign w:val="baseline"/>
-              </w:rPr>
-            </w:pPr>
-            <w:r>
-              <w:rPr>
-                <w:rtl w:val="0"/>
-              </w:rPr>
-            </w:r>
-          </w:p>
-        </w:tc>
-        <w:tc>
-          <w:tcPr>
-            <w:gridSpan w:val="2"/>
-            <w:tcBorders>
-              <w:top w:color="000000" w:space="0" w:sz="4" w:val="single"/>
-              <w:left w:color="000000" w:space="0" w:sz="0" w:val="nil"/>
-              <w:bottom w:color="000000" w:space="0" w:sz="4" w:val="single"/>
-              <w:right w:color="000000" w:space="0" w:sz="4" w:val="single"/>
-            </w:tcBorders>
-            <w:vAlign w:val="center"/>
-          </w:tcPr>
-          <w:p>
-            <w:r>
-              <w:t>{{participante3}}</w:t>
-            </w:r>
-          </w:p>
-        </w:tc>
-        <w:tc>
-          <w:tcPr>
-            <w:gridSpan w:val="3"/>
-            <w:tcBorders>
-              <w:top w:color="000000" w:space="0" w:sz="4" w:val="single"/>
-              <w:left w:color="000000" w:space="0" w:sz="0" w:val="nil"/>
-              <w:bottom w:color="000000" w:space="0" w:sz="4" w:val="single"/>
-              <w:right w:color="000000" w:space="0" w:sz="4" w:val="single"/>
-            </w:tcBorders>
-            <w:vAlign w:val="center"/>
-          </w:tcPr>
-          <w:p>
-            <w:r>
-              <w:t>{{cargo3}}</w:t>
-            </w:r>
-          </w:p>
-        </w:tc>
-        <w:tc>
-          <w:tcPr>
-            <w:gridSpan w:val="4"/>
-            <w:tcBorders>
-              <w:top w:color="000000" w:space="0" w:sz="4" w:val="single"/>
-              <w:left w:color="000000" w:space="0" w:sz="0" w:val="nil"/>
-              <w:bottom w:color="000000" w:space="0" w:sz="4" w:val="single"/>
-              <w:right w:color="000000" w:space="0" w:sz="4" w:val="single"/>
-            </w:tcBorders>
-            <w:vAlign w:val="center"/>
-          </w:tcPr>
-          <w:p>
-            <w:pPr>
-              <w:spacing w:after="0" w:line="240" w:lineRule="auto"/>
-              <w:jc w:val="center"/>
-              <w:rPr>
-                <w:rFonts w:ascii="Arial" w:cs="Arial" w:eastAsia="Arial" w:hAnsi="Arial"/>
-                <w:sz w:val="18"/>
-                <w:szCs w:val="18"/>
-                <w:vertAlign w:val="baseline"/>
-              </w:rPr>
-            </w:pPr>
-            <w:r>
-              <w:rPr>
-                <w:rFonts w:ascii="Arial" w:cs="Arial" w:eastAsia="Arial" w:hAnsi="Arial"/>
-                <w:sz w:val="18"/>
-                <w:szCs w:val="18"/>
-                <w:rtl w:val="0"/>
-              </w:rPr>
-              <w:t xml:space="preserve">Firma electrónica</w:t>
-            </w:r>
-            <w:r>
-              <w:rPr>
-                <w:rtl w:val="0"/>
-              </w:rPr>
             </w:r>
           </w:p>
         </w:tc>
@@ -2893,7 +2627,7 @@
                 <w:vertAlign w:val="baseline"/>
                 <w:rtl w:val="0"/>
               </w:rPr>
-              <w:t xml:space="preserve">1.</w:t>
+              <w:t xml:space="preserve">{{compromisoNumero}}</w:t>
             </w:r>
           </w:p>
         </w:tc>
@@ -2942,92 +2676,6 @@
           <w:p>
             <w:r>
               <w:t>{{fecha1}}</w:t>
-            </w:r>
-          </w:p>
-        </w:tc>
-      </w:tr>
-      <w:tr>
-        <w:trPr>
-          <w:cantSplit w:val="0"/>
-          <w:trHeight w:val="964" w:hRule="atLeast"/>
-          <w:tblHeader w:val="0"/>
-        </w:trPr>
-        <w:tc>
-          <w:tcPr>
-            <w:tcBorders>
-              <w:top w:color="000000" w:space="0" w:sz="4" w:val="single"/>
-              <w:left w:color="000000" w:space="0" w:sz="4" w:val="single"/>
-              <w:bottom w:color="000000" w:space="0" w:sz="4" w:val="single"/>
-              <w:right w:color="000000" w:space="0" w:sz="4" w:val="single"/>
-            </w:tcBorders>
-            <w:vAlign w:val="center"/>
-          </w:tcPr>
-          <w:p>
-            <w:pPr>
-              <w:spacing w:after="0" w:line="240" w:lineRule="auto"/>
-              <w:jc w:val="center"/>
-              <w:rPr>
-                <w:rFonts w:ascii="Arial" w:cs="Arial" w:eastAsia="Arial" w:hAnsi="Arial"/>
-                <w:sz w:val="18"/>
-                <w:szCs w:val="18"/>
-              </w:rPr>
-            </w:pPr>
-            <w:r>
-              <w:rPr>
-                <w:rFonts w:ascii="Arial" w:cs="Arial" w:eastAsia="Arial" w:hAnsi="Arial"/>
-                <w:sz w:val="18"/>
-                <w:szCs w:val="18"/>
-                <w:rtl w:val="0"/>
-              </w:rPr>
-              <w:t xml:space="preserve">2.</w:t>
-            </w:r>
-          </w:p>
-        </w:tc>
-        <w:tc>
-          <w:tcPr>
-            <w:tcBorders>
-              <w:top w:color="000000" w:space="0" w:sz="4" w:val="single"/>
-              <w:left w:color="000000" w:space="0" w:sz="0" w:val="nil"/>
-              <w:bottom w:color="000000" w:space="0" w:sz="4" w:val="single"/>
-              <w:right w:color="000000" w:space="0" w:sz="4" w:val="single"/>
-            </w:tcBorders>
-            <w:vAlign w:val="center"/>
-          </w:tcPr>
-          <w:p>
-            <w:r>
-              <w:t>{{compromiso2}}</w:t>
-            </w:r>
-          </w:p>
-        </w:tc>
-        <w:tc>
-          <w:tcPr>
-            <w:tcBorders>
-              <w:top w:color="000000" w:space="0" w:sz="4" w:val="single"/>
-              <w:left w:color="000000" w:space="0" w:sz="0" w:val="nil"/>
-              <w:bottom w:color="000000" w:space="0" w:sz="4" w:val="single"/>
-              <w:right w:color="000000" w:space="0" w:sz="4" w:val="single"/>
-            </w:tcBorders>
-            <w:vAlign w:val="center"/>
-          </w:tcPr>
-          <w:p>
-            <w:r>
-              <w:t>{{responsable2}}</w:t>
-            </w:r>
-          </w:p>
-        </w:tc>
-        <w:tc>
-          <w:tcPr>
-            <w:tcBorders>
-              <w:top w:color="000000" w:space="0" w:sz="4" w:val="single"/>
-              <w:left w:color="000000" w:space="0" w:sz="0" w:val="nil"/>
-              <w:bottom w:color="000000" w:space="0" w:sz="4" w:val="single"/>
-              <w:right w:color="000000" w:space="0" w:sz="4" w:val="single"/>
-            </w:tcBorders>
-            <w:vAlign w:val="center"/>
-          </w:tcPr>
-          <w:p>
-            <w:r>
-              <w:t>{{fecha2}}</w:t>
             </w:r>
           </w:p>
         </w:tc>

</xml_diff>

<commit_message>
Corrige filas y alineacion de agenda en actas
</commit_message>
<xml_diff>
--- a/resources/templates/plantilla_acta_institucional.docx
+++ b/resources/templates/plantilla_acta_institucional.docx
@@ -1262,6 +1262,7 @@
               <w:right w:color="000000" w:space="0" w:sz="4" w:val="single"/>
             </w:tcBorders>
             <w:shd w:fill="auto" w:val="clear"/>
+            <w:vAlign w:val="center"/>
           </w:tcPr>
           <w:p>
             <w:pPr>
@@ -1358,6 +1359,7 @@
               <w:bottom w:color="000000" w:space="0" w:sz="0" w:val="nil"/>
               <w:right w:color="000000" w:space="0" w:sz="0" w:val="nil"/>
             </w:tcBorders>
+            <w:vAlign w:val="center"/>
           </w:tcPr>
           <w:p>
             <w:pPr>
@@ -1405,7 +1407,7 @@
                 <w:vertAlign w:val="baseline"/>
                 <w:rtl w:val="0"/>
               </w:rPr>
-              <w:t xml:space="preserve">1.</w:t>
+              <w:t xml:space="preserve">{{agendaNumero1}}</w:t>
             </w:r>
           </w:p>
         </w:tc>
@@ -1421,7 +1423,7 @@
           </w:tcPr>
           <w:p>
             <w:r>
-              <w:t>{{agenda}}</w:t>
+              <w:t>{{agenda1}}</w:t>
             </w:r>
           </w:p>
         </w:tc>
@@ -1482,6 +1484,7 @@
               <w:bottom w:color="000000" w:space="0" w:sz="0" w:val="nil"/>
               <w:right w:color="000000" w:space="0" w:sz="0" w:val="nil"/>
             </w:tcBorders>
+            <w:vAlign w:val="center"/>
           </w:tcPr>
           <w:p>
             <w:pPr>
@@ -1528,17 +1531,17 @@
                 <w:szCs w:val="18"/>
                 <w:rtl w:val="0"/>
               </w:rPr>
-              <w:t xml:space="preserve">2</w:t>
-            </w:r>
-            <w:r>
-              <w:rPr>
-                <w:rFonts w:ascii="Arial" w:cs="Arial" w:eastAsia="Arial" w:hAnsi="Arial"/>
-                <w:sz w:val="18"/>
-                <w:szCs w:val="18"/>
-                <w:vertAlign w:val="baseline"/>
-                <w:rtl w:val="0"/>
-              </w:rPr>
-              <w:t xml:space="preserve">.</w:t>
+              <w:t xml:space="preserve">{{agendaNumero2}}</w:t>
+            </w:r>
+            <w:r>
+              <w:rPr>
+                <w:rFonts w:ascii="Arial" w:cs="Arial" w:eastAsia="Arial" w:hAnsi="Arial"/>
+                <w:sz w:val="18"/>
+                <w:szCs w:val="18"/>
+                <w:vertAlign w:val="baseline"/>
+                <w:rtl w:val="0"/>
+              </w:rPr>
+              <w:t xml:space="preserve"/>
             </w:r>
           </w:p>
         </w:tc>
@@ -1554,6 +1557,9 @@
           </w:tcPr>
           <w:p>
             <w:r/>
+            <w:r>
+              <w:t>{{agenda2}}</w:t>
+            </w:r>
           </w:p>
         </w:tc>
       </w:tr>
@@ -1613,6 +1619,7 @@
               <w:bottom w:color="000000" w:space="0" w:sz="0" w:val="nil"/>
               <w:right w:color="000000" w:space="0" w:sz="0" w:val="nil"/>
             </w:tcBorders>
+            <w:vAlign w:val="center"/>
           </w:tcPr>
           <w:p>
             <w:pPr>
@@ -1658,7 +1665,7 @@
                 <w:szCs w:val="18"/>
                 <w:rtl w:val="0"/>
               </w:rPr>
-              <w:t xml:space="preserve">3.</w:t>
+              <w:t xml:space="preserve">{{agendaNumero3}}</w:t>
             </w:r>
           </w:p>
         </w:tc>
@@ -1674,6 +1681,9 @@
           </w:tcPr>
           <w:p>
             <w:r/>
+            <w:r>
+              <w:t>{{agenda3}}</w:t>
+            </w:r>
           </w:p>
         </w:tc>
       </w:tr>
@@ -1733,6 +1743,7 @@
               <w:bottom w:color="000000" w:space="0" w:sz="0" w:val="nil"/>
               <w:right w:color="000000" w:space="0" w:sz="0" w:val="nil"/>
             </w:tcBorders>
+            <w:vAlign w:val="center"/>
           </w:tcPr>
           <w:p>
             <w:pPr>
@@ -1779,7 +1790,7 @@
                 <w:szCs w:val="18"/>
                 <w:rtl w:val="0"/>
               </w:rPr>
-              <w:t xml:space="preserve">4.</w:t>
+              <w:t xml:space="preserve">{{agendaNumero4}}</w:t>
             </w:r>
             <w:r>
               <w:rPr>
@@ -1800,6 +1811,9 @@
           </w:tcPr>
           <w:p>
             <w:r/>
+            <w:r>
+              <w:t>{{agenda4}}</w:t>
+            </w:r>
           </w:p>
         </w:tc>
       </w:tr>
@@ -2314,7 +2328,7 @@
               <w:bottom w:color="000000" w:space="0" w:sz="4" w:val="single"/>
               <w:right w:color="000000" w:space="0" w:sz="4" w:val="single"/>
             </w:tcBorders>
-            <w:vAlign w:val="top"/>
+            <w:vAlign w:val="center"/>
           </w:tcPr>
           <w:p>
             <w:r>
@@ -2725,7 +2739,7 @@
               <w:top w:color="000000" w:space="0" w:sz="0" w:val="nil"/>
               <w:bottom w:color="000000" w:space="0" w:sz="0" w:val="nil"/>
             </w:tcBorders>
-            <w:vAlign w:val="top"/>
+            <w:vAlign w:val="center"/>
           </w:tcPr>
           <w:p>
             <w:pPr>
@@ -2811,7 +2825,7 @@
               <w:bottom w:color="000000" w:space="0" w:sz="4" w:val="single"/>
               <w:right w:color="000000" w:space="0" w:sz="4" w:val="single"/>
             </w:tcBorders>
-            <w:vAlign w:val="top"/>
+            <w:vAlign w:val="center"/>
           </w:tcPr>
           <w:p>
             <w:r>

</xml_diff>

<commit_message>
Ajusta centrado visual y descarga de actas
</commit_message>
<xml_diff>
--- a/resources/templates/plantilla_acta_institucional.docx
+++ b/resources/templates/plantilla_acta_institucional.docx
@@ -97,7 +97,7 @@
           </w:tcPr>
           <w:p>
             <w:pPr>
-              <w:spacing w:after="0" w:line="240" w:lineRule="auto"/>
+              <w:spacing w:after="0" w:line="240" w:lineRule="auto" w:before="0"/>
               <w:rPr>
                 <w:rFonts w:ascii="Arial" w:cs="Arial" w:eastAsia="Arial" w:hAnsi="Arial"/>
                 <w:b w:val="0"/>
@@ -139,6 +139,9 @@
             <w:vAlign w:val="center"/>
           </w:tcPr>
           <w:p>
+            <w:pPr>
+              <w:spacing w:before="0" w:after="0"/>
+            </w:pPr>
             <w:r>
               <w:t>{{titulo}}</w:t>
             </w:r>
@@ -157,7 +160,7 @@
           </w:tcPr>
           <w:p>
             <w:pPr>
-              <w:spacing w:after="0" w:line="240" w:lineRule="auto"/>
+              <w:spacing w:after="0" w:line="240" w:lineRule="auto" w:before="0"/>
               <w:jc w:val="center"/>
               <w:rPr>
                 <w:rFonts w:ascii="Arial" w:cs="Arial" w:eastAsia="Arial" w:hAnsi="Arial"/>
@@ -201,7 +204,7 @@
           </w:tcPr>
           <w:p>
             <w:pPr>
-              <w:spacing w:after="0" w:line="240" w:lineRule="auto"/>
+              <w:spacing w:after="0" w:line="240" w:lineRule="auto" w:before="0"/>
               <w:jc w:val="center"/>
               <w:rPr>
                 <w:rFonts w:ascii="Arial" w:cs="Arial" w:eastAsia="Arial" w:hAnsi="Arial"/>
@@ -243,7 +246,7 @@
           </w:tcPr>
           <w:p>
             <w:pPr>
-              <w:spacing w:after="0" w:line="240" w:lineRule="auto"/>
+              <w:spacing w:after="0" w:line="240" w:lineRule="auto" w:before="0"/>
               <w:jc w:val="center"/>
               <w:rPr>
                 <w:rFonts w:ascii="Arial" w:cs="Arial" w:eastAsia="Arial" w:hAnsi="Arial"/>
@@ -286,7 +289,7 @@
           </w:tcPr>
           <w:p>
             <w:pPr>
-              <w:spacing w:after="0" w:line="240" w:lineRule="auto"/>
+              <w:spacing w:after="0" w:line="240" w:lineRule="auto" w:before="0"/>
               <w:rPr>
                 <w:rFonts w:ascii="Arial" w:cs="Arial" w:eastAsia="Arial" w:hAnsi="Arial"/>
                 <w:b w:val="0"/>
@@ -356,7 +359,7 @@
           </w:tcPr>
           <w:p>
             <w:pPr>
-              <w:spacing w:after="0" w:line="240" w:lineRule="auto"/>
+              <w:spacing w:after="0" w:line="240" w:lineRule="auto" w:before="0"/>
               <w:rPr>
                 <w:rFonts w:ascii="Arial" w:cs="Arial" w:eastAsia="Arial" w:hAnsi="Arial"/>
                 <w:b w:val="0"/>
@@ -406,7 +409,7 @@
           </w:tcPr>
           <w:p>
             <w:pPr>
-              <w:spacing w:after="0" w:line="240" w:lineRule="auto"/>
+              <w:spacing w:after="0" w:line="240" w:lineRule="auto" w:before="0"/>
               <w:rPr>
                 <w:rFonts w:ascii="Arial" w:cs="Arial" w:eastAsia="Arial" w:hAnsi="Arial"/>
                 <w:b w:val="0"/>
@@ -448,6 +451,9 @@
             <w:vAlign w:val="center"/>
           </w:tcPr>
           <w:p>
+            <w:pPr>
+              <w:spacing w:before="0" w:after="0"/>
+            </w:pPr>
             <w:r>
               <w:t>{{organizador}}</w:t>
             </w:r>
@@ -466,7 +472,7 @@
           </w:tcPr>
           <w:p>
             <w:pPr>
-              <w:spacing w:after="0" w:line="240" w:lineRule="auto"/>
+              <w:spacing w:after="0" w:line="240" w:lineRule="auto" w:before="0"/>
               <w:jc w:val="center"/>
               <w:rPr>
                 <w:rFonts w:ascii="Arial" w:cs="Arial" w:eastAsia="Arial" w:hAnsi="Arial"/>
@@ -509,6 +515,9 @@
             <w:vAlign w:val="center"/>
           </w:tcPr>
           <w:p>
+            <w:pPr>
+              <w:spacing w:before="0" w:after="0"/>
+            </w:pPr>
             <w:r>
               <w:t>{{lugar}}</w:t>
             </w:r>
@@ -527,7 +536,7 @@
           </w:tcPr>
           <w:p>
             <w:pPr>
-              <w:spacing w:after="0" w:line="240" w:lineRule="auto"/>
+              <w:spacing w:after="0" w:line="240" w:lineRule="auto" w:before="0"/>
               <w:jc w:val="center"/>
               <w:rPr>
                 <w:rFonts w:ascii="Arial" w:cs="Arial" w:eastAsia="Arial" w:hAnsi="Arial"/>
@@ -570,7 +579,7 @@
           </w:tcPr>
           <w:p>
             <w:pPr>
-              <w:spacing w:after="0" w:line="240" w:lineRule="auto"/>
+              <w:spacing w:after="0" w:line="240" w:lineRule="auto" w:before="0"/>
               <w:rPr>
                 <w:rFonts w:ascii="Arial" w:cs="Arial" w:eastAsia="Arial" w:hAnsi="Arial"/>
                 <w:b w:val="0"/>
@@ -617,7 +626,7 @@
           </w:tcPr>
           <w:p>
             <w:pPr>
-              <w:spacing w:after="0" w:line="240" w:lineRule="auto"/>
+              <w:spacing w:after="0" w:line="240" w:lineRule="auto" w:before="0"/>
               <w:rPr>
                 <w:rFonts w:ascii="Arial" w:cs="Arial" w:eastAsia="Arial" w:hAnsi="Arial"/>
                 <w:b w:val="0"/>
@@ -667,7 +676,7 @@
           </w:tcPr>
           <w:p>
             <w:pPr>
-              <w:spacing w:after="0" w:line="240" w:lineRule="auto"/>
+              <w:spacing w:after="0" w:line="240" w:lineRule="auto" w:before="0"/>
               <w:jc w:val="center"/>
               <w:rPr>
                 <w:rFonts w:ascii="Arial" w:cs="Arial" w:eastAsia="Arial" w:hAnsi="Arial"/>
@@ -720,7 +729,7 @@
           </w:tcPr>
           <w:p>
             <w:pPr>
-              <w:spacing w:after="0" w:line="240" w:lineRule="auto"/>
+              <w:spacing w:after="0" w:line="240" w:lineRule="auto" w:before="0"/>
               <w:jc w:val="center"/>
               <w:rPr>
                 <w:rFonts w:ascii="Arial" w:cs="Arial" w:eastAsia="Arial" w:hAnsi="Arial"/>
@@ -764,7 +773,7 @@
           </w:tcPr>
           <w:p>
             <w:pPr>
-              <w:spacing w:after="0" w:line="240" w:lineRule="auto"/>
+              <w:spacing w:after="0" w:line="240" w:lineRule="auto" w:before="0"/>
               <w:jc w:val="center"/>
               <w:rPr>
                 <w:rFonts w:ascii="Arial" w:cs="Arial" w:eastAsia="Arial" w:hAnsi="Arial"/>
@@ -808,7 +817,7 @@
           </w:tcPr>
           <w:p>
             <w:pPr>
-              <w:spacing w:after="0" w:line="240" w:lineRule="auto"/>
+              <w:spacing w:after="0" w:line="240" w:lineRule="auto" w:before="0"/>
               <w:jc w:val="center"/>
               <w:rPr>
                 <w:rFonts w:ascii="Arial" w:cs="Arial" w:eastAsia="Arial" w:hAnsi="Arial"/>
@@ -911,6 +920,9 @@
             <w:vAlign w:val="center"/>
           </w:tcPr>
           <w:p>
+            <w:pPr>
+              <w:spacing w:before="0" w:after="0"/>
+            </w:pPr>
             <w:r>
               <w:t>{{participante1}}</w:t>
             </w:r>
@@ -928,6 +940,9 @@
             <w:vAlign w:val="center"/>
           </w:tcPr>
           <w:p>
+            <w:pPr>
+              <w:spacing w:before="0" w:after="0"/>
+            </w:pPr>
             <w:r>
               <w:t>{{cargo1}}</w:t>
             </w:r>
@@ -946,7 +961,7 @@
           </w:tcPr>
           <w:p>
             <w:pPr>
-              <w:spacing w:after="0" w:line="240" w:lineRule="auto"/>
+              <w:spacing w:after="0" w:line="240" w:lineRule="auto" w:before="0"/>
               <w:jc w:val="center"/>
               <w:rPr>
                 <w:rFonts w:ascii="Arial" w:cs="Arial" w:eastAsia="Arial" w:hAnsi="Arial"/>
@@ -1221,7 +1236,7 @@
           </w:tcPr>
           <w:p>
             <w:pPr>
-              <w:spacing w:after="0" w:line="240" w:lineRule="auto"/>
+              <w:spacing w:after="0" w:line="240" w:lineRule="auto" w:before="0"/>
               <w:jc w:val="center"/>
               <w:rPr>
                 <w:rFonts w:ascii="Arial" w:cs="Arial" w:eastAsia="Arial" w:hAnsi="Arial"/>
@@ -1266,7 +1281,7 @@
           </w:tcPr>
           <w:p>
             <w:pPr>
-              <w:spacing w:after="0" w:line="240" w:lineRule="auto"/>
+              <w:spacing w:after="0" w:line="240" w:lineRule="auto" w:before="0"/>
               <w:rPr>
                 <w:rFonts w:ascii="Arial" w:cs="Arial" w:eastAsia="Arial" w:hAnsi="Arial"/>
                 <w:sz w:val="20"/>
@@ -1295,7 +1310,7 @@
           </w:tcPr>
           <w:p>
             <w:pPr>
-              <w:spacing w:after="0" w:line="240" w:lineRule="auto"/>
+              <w:spacing w:after="0" w:line="240" w:lineRule="auto" w:before="0"/>
               <w:jc w:val="center"/>
               <w:rPr>
                 <w:rFonts w:ascii="Arial" w:cs="Arial" w:eastAsia="Arial" w:hAnsi="Arial"/>
@@ -1346,6 +1361,9 @@
             <w:vAlign w:val="center"/>
           </w:tcPr>
           <w:p>
+            <w:pPr>
+              <w:spacing w:before="0" w:after="0"/>
+            </w:pPr>
             <w:r>
               <w:t>{{objetivo}}</w:t>
             </w:r>
@@ -1363,7 +1381,7 @@
           </w:tcPr>
           <w:p>
             <w:pPr>
-              <w:spacing w:after="0" w:line="240" w:lineRule="auto"/>
+              <w:spacing w:after="0" w:line="240" w:lineRule="auto" w:before="0"/>
               <w:rPr>
                 <w:rFonts w:ascii="Arial" w:cs="Arial" w:eastAsia="Arial" w:hAnsi="Arial"/>
                 <w:sz w:val="20"/>
@@ -1390,7 +1408,7 @@
           </w:tcPr>
           <w:p>
             <w:pPr>
-              <w:spacing w:after="0" w:line="240" w:lineRule="auto"/>
+              <w:spacing w:after="0" w:line="240" w:lineRule="auto" w:before="0"/>
               <w:jc w:val="center"/>
               <w:rPr>
                 <w:rFonts w:ascii="Arial" w:cs="Arial" w:eastAsia="Arial" w:hAnsi="Arial"/>
@@ -1422,6 +1440,9 @@
             <w:vAlign w:val="center"/>
           </w:tcPr>
           <w:p>
+            <w:pPr>
+              <w:spacing w:before="0" w:after="0"/>
+            </w:pPr>
             <w:r>
               <w:t>{{agenda1}}</w:t>
             </w:r>
@@ -1488,7 +1509,7 @@
           </w:tcPr>
           <w:p>
             <w:pPr>
-              <w:spacing w:after="0" w:line="240" w:lineRule="auto"/>
+              <w:spacing w:after="0" w:line="240" w:lineRule="auto" w:before="0"/>
               <w:rPr>
                 <w:rFonts w:ascii="Arial" w:cs="Arial" w:eastAsia="Arial" w:hAnsi="Arial"/>
                 <w:sz w:val="20"/>
@@ -1515,7 +1536,7 @@
           </w:tcPr>
           <w:p>
             <w:pPr>
-              <w:spacing w:after="0" w:line="240" w:lineRule="auto"/>
+              <w:spacing w:after="0" w:line="240" w:lineRule="auto" w:before="0"/>
               <w:jc w:val="center"/>
               <w:rPr>
                 <w:rFonts w:ascii="Arial" w:cs="Arial" w:eastAsia="Arial" w:hAnsi="Arial"/>
@@ -1556,6 +1577,9 @@
             <w:vAlign w:val="center"/>
           </w:tcPr>
           <w:p>
+            <w:pPr>
+              <w:spacing w:before="0" w:after="0"/>
+            </w:pPr>
             <w:r/>
             <w:r>
               <w:t>{{agenda2}}</w:t>
@@ -1623,7 +1647,7 @@
           </w:tcPr>
           <w:p>
             <w:pPr>
-              <w:spacing w:after="0" w:line="240" w:lineRule="auto"/>
+              <w:spacing w:after="0" w:line="240" w:lineRule="auto" w:before="0"/>
               <w:rPr>
                 <w:rFonts w:ascii="Arial" w:cs="Arial" w:eastAsia="Arial" w:hAnsi="Arial"/>
                 <w:sz w:val="20"/>
@@ -1650,7 +1674,7 @@
           </w:tcPr>
           <w:p>
             <w:pPr>
-              <w:spacing w:after="0" w:line="240" w:lineRule="auto"/>
+              <w:spacing w:after="0" w:line="240" w:lineRule="auto" w:before="0"/>
               <w:jc w:val="center"/>
               <w:rPr>
                 <w:rFonts w:ascii="Arial" w:cs="Arial" w:eastAsia="Arial" w:hAnsi="Arial"/>
@@ -1680,6 +1704,9 @@
             <w:vAlign w:val="center"/>
           </w:tcPr>
           <w:p>
+            <w:pPr>
+              <w:spacing w:before="0" w:after="0"/>
+            </w:pPr>
             <w:r/>
             <w:r>
               <w:t>{{agenda3}}</w:t>
@@ -1747,7 +1774,7 @@
           </w:tcPr>
           <w:p>
             <w:pPr>
-              <w:spacing w:after="0" w:line="240" w:lineRule="auto"/>
+              <w:spacing w:after="0" w:line="240" w:lineRule="auto" w:before="0"/>
               <w:rPr>
                 <w:rFonts w:ascii="Arial" w:cs="Arial" w:eastAsia="Arial" w:hAnsi="Arial"/>
                 <w:sz w:val="20"/>
@@ -1774,7 +1801,7 @@
           </w:tcPr>
           <w:p>
             <w:pPr>
-              <w:spacing w:after="0" w:line="240" w:lineRule="auto"/>
+              <w:spacing w:after="0" w:line="240" w:lineRule="auto" w:before="0"/>
               <w:jc w:val="center"/>
               <w:rPr>
                 <w:rFonts w:ascii="Arial" w:cs="Arial" w:eastAsia="Arial" w:hAnsi="Arial"/>
@@ -1810,6 +1837,9 @@
             <w:vAlign w:val="center"/>
           </w:tcPr>
           <w:p>
+            <w:pPr>
+              <w:spacing w:before="0" w:after="0"/>
+            </w:pPr>
             <w:r/>
             <w:r>
               <w:t>{{agenda4}}</w:t>
@@ -1881,7 +1911,7 @@
           </w:tcPr>
           <w:p>
             <w:pPr>
-              <w:spacing w:after="0" w:line="240" w:lineRule="auto"/>
+              <w:spacing w:after="0" w:line="240" w:lineRule="auto" w:before="0"/>
               <w:jc w:val="center"/>
               <w:rPr>
                 <w:rFonts w:ascii="Arial" w:cs="Arial" w:eastAsia="Arial" w:hAnsi="Arial"/>
@@ -1933,7 +1963,7 @@
           </w:tcPr>
           <w:p>
             <w:pPr>
-              <w:spacing w:after="0" w:line="240" w:lineRule="auto"/>
+              <w:spacing w:after="0" w:line="240" w:lineRule="auto" w:before="0"/>
               <w:jc w:val="center"/>
               <w:rPr>
                 <w:rFonts w:ascii="Arial" w:cs="Arial" w:eastAsia="Arial" w:hAnsi="Arial"/>
@@ -1976,7 +2006,7 @@
           </w:tcPr>
           <w:p>
             <w:pPr>
-              <w:spacing w:after="0" w:line="240" w:lineRule="auto"/>
+              <w:spacing w:after="0" w:line="240" w:lineRule="auto" w:before="0"/>
               <w:jc w:val="center"/>
               <w:rPr>
                 <w:rFonts w:ascii="Arial" w:cs="Arial" w:eastAsia="Arial" w:hAnsi="Arial"/>
@@ -2019,7 +2049,7 @@
           </w:tcPr>
           <w:p>
             <w:pPr>
-              <w:spacing w:after="0" w:line="240" w:lineRule="auto"/>
+              <w:spacing w:after="0" w:line="240" w:lineRule="auto" w:before="0"/>
               <w:jc w:val="center"/>
               <w:rPr>
                 <w:rFonts w:ascii="Arial" w:cs="Arial" w:eastAsia="Arial" w:hAnsi="Arial"/>
@@ -2062,7 +2092,7 @@
           </w:tcPr>
           <w:p>
             <w:pPr>
-              <w:spacing w:after="0" w:line="240" w:lineRule="auto"/>
+              <w:spacing w:after="0" w:line="240" w:lineRule="auto" w:before="0"/>
               <w:jc w:val="center"/>
               <w:rPr>
                 <w:rFonts w:ascii="Arial" w:cs="Arial" w:eastAsia="Arial" w:hAnsi="Arial"/>
@@ -2111,7 +2141,7 @@
           </w:tcPr>
           <w:p>
             <w:pPr>
-              <w:spacing w:after="0" w:line="240" w:lineRule="auto"/>
+              <w:spacing w:after="0" w:line="240" w:lineRule="auto" w:before="0"/>
               <w:jc w:val="both"/>
               <w:rPr>
                 <w:rFonts w:ascii="Arial" w:cs="Arial" w:eastAsia="Arial" w:hAnsi="Arial"/>
@@ -2142,7 +2172,7 @@
           </w:tcPr>
           <w:p>
             <w:pPr>
-              <w:spacing w:after="0" w:line="240" w:lineRule="auto"/>
+              <w:spacing w:after="0" w:line="240" w:lineRule="auto" w:before="0"/>
               <w:jc w:val="center"/>
               <w:rPr>
                 <w:rFonts w:ascii="Arial" w:cs="Arial" w:eastAsia="Arial" w:hAnsi="Arial"/>
@@ -2173,7 +2203,7 @@
           </w:tcPr>
           <w:p>
             <w:pPr>
-              <w:spacing w:after="0" w:line="240" w:lineRule="auto"/>
+              <w:spacing w:after="0" w:line="240" w:lineRule="auto" w:before="0"/>
               <w:jc w:val="center"/>
               <w:rPr>
                 <w:rFonts w:ascii="Arial" w:cs="Arial" w:eastAsia="Arial" w:hAnsi="Arial"/>
@@ -2204,7 +2234,7 @@
           </w:tcPr>
           <w:p>
             <w:pPr>
-              <w:spacing w:after="0" w:line="240" w:lineRule="auto"/>
+              <w:spacing w:after="0" w:line="240" w:lineRule="auto" w:before="0"/>
               <w:jc w:val="center"/>
               <w:rPr>
                 <w:rFonts w:ascii="Arial" w:cs="Arial" w:eastAsia="Arial" w:hAnsi="Arial"/>
@@ -2281,7 +2311,7 @@
           </w:tcPr>
           <w:p>
             <w:pPr>
-              <w:spacing w:after="0" w:line="240" w:lineRule="auto"/>
+              <w:spacing w:after="0" w:line="240" w:lineRule="auto" w:before="0"/>
               <w:jc w:val="center"/>
               <w:rPr>
                 <w:rFonts w:ascii="Arial" w:cs="Arial" w:eastAsia="Arial" w:hAnsi="Arial"/>
@@ -2331,6 +2361,9 @@
             <w:vAlign w:val="center"/>
           </w:tcPr>
           <w:p>
+            <w:pPr>
+              <w:spacing w:before="0" w:after="0"/>
+            </w:pPr>
             <w:r>
               <w:t>{{desarrollo}}</w:t>
             </w:r>
@@ -2396,7 +2429,7 @@
           </w:tcPr>
           <w:p>
             <w:pPr>
-              <w:spacing w:after="0" w:line="240" w:lineRule="auto"/>
+              <w:spacing w:after="0" w:line="240" w:lineRule="auto" w:before="0"/>
               <w:jc w:val="center"/>
               <w:rPr>
                 <w:rFonts w:ascii="Arial" w:cs="Arial" w:eastAsia="Arial" w:hAnsi="Arial"/>
@@ -2446,7 +2479,7 @@
           </w:tcPr>
           <w:p>
             <w:pPr>
-              <w:spacing w:after="0" w:line="240" w:lineRule="auto"/>
+              <w:spacing w:after="0" w:line="240" w:lineRule="auto" w:before="0"/>
               <w:jc w:val="center"/>
               <w:rPr>
                 <w:rFonts w:ascii="Arial" w:cs="Arial" w:eastAsia="Arial" w:hAnsi="Arial"/>
@@ -2489,7 +2522,7 @@
           </w:tcPr>
           <w:p>
             <w:pPr>
-              <w:spacing w:after="0" w:line="240" w:lineRule="auto"/>
+              <w:spacing w:after="0" w:line="240" w:lineRule="auto" w:before="0"/>
               <w:jc w:val="center"/>
               <w:rPr>
                 <w:rFonts w:ascii="Arial" w:cs="Arial" w:eastAsia="Arial" w:hAnsi="Arial"/>
@@ -2532,7 +2565,7 @@
           </w:tcPr>
           <w:p>
             <w:pPr>
-              <w:spacing w:after="0" w:line="240" w:lineRule="auto"/>
+              <w:spacing w:after="0" w:line="240" w:lineRule="auto" w:before="0"/>
               <w:jc w:val="center"/>
               <w:rPr>
                 <w:rFonts w:ascii="Arial" w:cs="Arial" w:eastAsia="Arial" w:hAnsi="Arial"/>
@@ -2575,7 +2608,7 @@
           </w:tcPr>
           <w:p>
             <w:pPr>
-              <w:spacing w:after="0" w:line="240" w:lineRule="auto"/>
+              <w:spacing w:after="0" w:line="240" w:lineRule="auto" w:before="0"/>
               <w:jc w:val="center"/>
               <w:rPr>
                 <w:rFonts w:ascii="Arial" w:cs="Arial" w:eastAsia="Arial" w:hAnsi="Arial"/>
@@ -2624,7 +2657,7 @@
           </w:tcPr>
           <w:p>
             <w:pPr>
-              <w:spacing w:after="0" w:line="240" w:lineRule="auto"/>
+              <w:spacing w:after="0" w:line="240" w:lineRule="auto" w:before="0"/>
               <w:jc w:val="center"/>
               <w:rPr>
                 <w:rFonts w:ascii="Arial" w:cs="Arial" w:eastAsia="Arial" w:hAnsi="Arial"/>
@@ -2656,6 +2689,9 @@
             <w:vAlign w:val="center"/>
           </w:tcPr>
           <w:p>
+            <w:pPr>
+              <w:spacing w:before="0" w:after="0"/>
+            </w:pPr>
             <w:r>
               <w:t>{{compromiso1}}</w:t>
             </w:r>
@@ -2672,6 +2708,9 @@
             <w:vAlign w:val="center"/>
           </w:tcPr>
           <w:p>
+            <w:pPr>
+              <w:spacing w:before="0" w:after="0"/>
+            </w:pPr>
             <w:r>
               <w:t>{{responsable1}}</w:t>
             </w:r>
@@ -2688,6 +2727,9 @@
             <w:vAlign w:val="center"/>
           </w:tcPr>
           <w:p>
+            <w:pPr>
+              <w:spacing w:before="0" w:after="0"/>
+            </w:pPr>
             <w:r>
               <w:t>{{fecha1}}</w:t>
             </w:r>
@@ -2743,7 +2785,7 @@
           </w:tcPr>
           <w:p>
             <w:pPr>
-              <w:spacing w:after="0" w:line="240" w:lineRule="auto"/>
+              <w:spacing w:after="0" w:line="240" w:lineRule="auto" w:before="0"/>
               <w:rPr>
                 <w:rFonts w:ascii="Arial" w:cs="Arial" w:eastAsia="Arial" w:hAnsi="Arial"/>
                 <w:sz w:val="20"/>
@@ -2778,7 +2820,7 @@
           </w:tcPr>
           <w:p>
             <w:pPr>
-              <w:spacing w:after="0" w:line="240" w:lineRule="auto"/>
+              <w:spacing w:after="0" w:line="240" w:lineRule="auto" w:before="0"/>
               <w:jc w:val="center"/>
               <w:rPr>
                 <w:rFonts w:ascii="Arial" w:cs="Arial" w:eastAsia="Arial" w:hAnsi="Arial"/>
@@ -2828,6 +2870,9 @@
             <w:vAlign w:val="center"/>
           </w:tcPr>
           <w:p>
+            <w:pPr>
+              <w:spacing w:before="0" w:after="0"/>
+            </w:pPr>
             <w:r>
               <w:t>{{conclusiones}}</w:t>
             </w:r>

</xml_diff>